<commit_message>
Drop the table of contents from the Word builds
Removes --toc from the pandoc invocation, along with everything added in
the previous commit to make the TOC field populate: the updateFields
setting, the TOCHeading/TOC1/TOC2 styles, and the fill_toc post-processing
that bookmarked headings and wrote the field's cached result.

Each chapter already opens with a "What this chapter covers" list, so the
generated contents was largely duplicating it, and Word's navigation pane
still works from the heading styles.

Verified on all six: no content controls, no fields, no placeholder text,
and each document now starts on its chapter title.

Co-authored-by: Cursor <cursoragent@cursor.com>
</commit_message>
<xml_diff>
--- a/education/docx/chapter01_kubernetes_k3s.docx
+++ b/education/docx/chapter01_kubernetes_k3s.docx
@@ -2,237 +2,11 @@
 <file path=word/document.xml><?xml version="1.0" encoding="utf-8"?>
 <w:document xmlns:w="http://schemas.openxmlformats.org/wordprocessingml/2006/main" xmlns:m="http://schemas.openxmlformats.org/officeDocument/2006/math" xmlns:r="http://schemas.openxmlformats.org/officeDocument/2006/relationships" xmlns:o="urn:schemas-microsoft-com:office:office" xmlns:v="urn:schemas-microsoft-com:vml" xmlns:w10="urn:schemas-microsoft-com:office:word" xmlns:a="http://schemas.openxmlformats.org/drawingml/2006/main" xmlns:pic="http://schemas.openxmlformats.org/drawingml/2006/picture" xmlns:wp="http://schemas.openxmlformats.org/drawingml/2006/wordprocessingDrawing">
   <w:body>
-    <w:sdt>
-      <w:sdtPr>
-        <w:docPartObj>
-          <w:docPartGallery w:val="Table of Contents"/>
-          <w:docPartUnique/>
-        </w:docPartObj>
-      </w:sdtPr>
-      <w:sdtContent>
-        <w:p>
-          <w:pPr>
-            <w:pStyle w:val="TOCHeading"/>
-          </w:pPr>
-          <w:r>
-            <w:t>Contents</w:t>
-          </w:r>
-        </w:p>
-        <w:p>
-          <w:pPr>
-            <w:pStyle w:val="TOC1"/>
-          </w:pPr>
-          <w:r>
-            <w:fldChar w:fldCharType="begin" w:dirty="true"/>
-            <w:instrText xml:space="preserve">TOC \o "1-2" \h \z \u</w:instrText>
-            <w:fldChar w:fldCharType="separate"/>
-          </w:r>
-          <w:hyperlink w:anchor="_Toc9001">
-            <w:r>
-              <w:t xml:space="preserve">Chapter 1 — Kubernetes, and the k3s Cluster We Just Built</w:t>
-            </w:r>
-          </w:hyperlink>
-        </w:p>
-        <w:p>
-          <w:pPr>
-            <w:pStyle w:val="TOC2"/>
-          </w:pPr>
-          <w:hyperlink w:anchor="_Toc9002">
-            <w:r>
-              <w:t xml:space="preserve">What this chapter covers</w:t>
-            </w:r>
-          </w:hyperlink>
-        </w:p>
-        <w:p>
-          <w:pPr>
-            <w:pStyle w:val="TOC2"/>
-          </w:pPr>
-          <w:hyperlink w:anchor="_Toc9003">
-            <w:r>
-              <w:t xml:space="preserve">1. The big picture — where Kubernetes sits</w:t>
-            </w:r>
-          </w:hyperlink>
-        </w:p>
-        <w:p>
-          <w:pPr>
-            <w:pStyle w:val="TOC2"/>
-          </w:pPr>
-          <w:hyperlink w:anchor="_Toc9004">
-            <w:r>
-              <w:t xml:space="preserve">2. What is Kubernetes actually for?</w:t>
-            </w:r>
-          </w:hyperlink>
-        </w:p>
-        <w:p>
-          <w:pPr>
-            <w:pStyle w:val="TOC2"/>
-          </w:pPr>
-          <w:hyperlink w:anchor="_Toc9005">
-            <w:r>
-              <w:t xml:space="preserve">2a. The ranch — a mental model</w:t>
-            </w:r>
-          </w:hyperlink>
-        </w:p>
-        <w:p>
-          <w:pPr>
-            <w:pStyle w:val="TOC2"/>
-          </w:pPr>
-          <w:hyperlink w:anchor="_Toc9006">
-            <w:r>
-              <w:t xml:space="preserve">3. What is k3s, and why did we use it?</w:t>
-            </w:r>
-          </w:hyperlink>
-        </w:p>
-        <w:p>
-          <w:pPr>
-            <w:pStyle w:val="TOC2"/>
-          </w:pPr>
-          <w:hyperlink w:anchor="_Toc9007">
-            <w:r>
-              <w:t xml:space="preserve">3a. The install command, piece by piece</w:t>
-            </w:r>
-          </w:hyperlink>
-        </w:p>
-        <w:p>
-          <w:pPr>
-            <w:pStyle w:val="TOC2"/>
-          </w:pPr>
-          <w:hyperlink w:anchor="_Toc9008">
-            <w:r>
-              <w:t xml:space="preserve">3b. What that one line left on the machine</w:t>
-            </w:r>
-          </w:hyperlink>
-        </w:p>
-        <w:p>
-          <w:pPr>
-            <w:pStyle w:val="TOC2"/>
-          </w:pPr>
-          <w:hyperlink w:anchor="_Toc9009">
-            <w:r>
-              <w:t xml:space="preserve">3c. Making kubectl work without sudo</w:t>
-            </w:r>
-          </w:hyperlink>
-        </w:p>
-        <w:p>
-          <w:pPr>
-            <w:pStyle w:val="TOC2"/>
-          </w:pPr>
-          <w:hyperlink w:anchor="_Toc9010">
-            <w:r>
-              <w:t xml:space="preserve">3d. Confirming it worked</w:t>
-            </w:r>
-          </w:hyperlink>
-        </w:p>
-        <w:p>
-          <w:pPr>
-            <w:pStyle w:val="TOC2"/>
-          </w:pPr>
-          <w:hyperlink w:anchor="_Toc9011">
-            <w:r>
-              <w:t xml:space="preserve">4. What is now running on the machine</w:t>
-            </w:r>
-          </w:hyperlink>
-        </w:p>
-        <w:p>
-          <w:pPr>
-            <w:pStyle w:val="TOC2"/>
-          </w:pPr>
-          <w:hyperlink w:anchor="_Toc9012">
-            <w:r>
-              <w:t xml:space="preserve">5. The three networks</w:t>
-            </w:r>
-          </w:hyperlink>
-        </w:p>
-        <w:p>
-          <w:pPr>
-            <w:pStyle w:val="TOC2"/>
-          </w:pPr>
-          <w:hyperlink w:anchor="_Toc9013">
-            <w:r>
-              <w:t xml:space="preserve">6. Storage — and an honest limitation</w:t>
-            </w:r>
-          </w:hyperlink>
-        </w:p>
-        <w:p>
-          <w:pPr>
-            <w:pStyle w:val="TOC2"/>
-          </w:pPr>
-          <w:hyperlink w:anchor="_Toc9014">
-            <w:r>
-              <w:t xml:space="preserve">7. Things that look broken but are not</w:t>
-            </w:r>
-          </w:hyperlink>
-        </w:p>
-        <w:p>
-          <w:pPr>
-            <w:pStyle w:val="TOC2"/>
-          </w:pPr>
-          <w:hyperlink w:anchor="_Toc9015">
-            <w:r>
-              <w:t xml:space="preserve">8. Where k3s differs from production Kubernetes</w:t>
-            </w:r>
-          </w:hyperlink>
-        </w:p>
-        <w:p>
-          <w:pPr>
-            <w:pStyle w:val="TOC2"/>
-          </w:pPr>
-          <w:hyperlink w:anchor="_Toc9016">
-            <w:r>
-              <w:t xml:space="preserve">9. Commands to know by heart</w:t>
-            </w:r>
-          </w:hyperlink>
-        </w:p>
-        <w:p>
-          <w:pPr>
-            <w:pStyle w:val="TOC2"/>
-          </w:pPr>
-          <w:hyperlink w:anchor="_Toc9017">
-            <w:r>
-              <w:t xml:space="preserve">10. Glossary for this chapter</w:t>
-            </w:r>
-          </w:hyperlink>
-        </w:p>
-        <w:p>
-          <w:pPr>
-            <w:pStyle w:val="TOC2"/>
-          </w:pPr>
-          <w:hyperlink w:anchor="_Toc9018">
-            <w:r>
-              <w:t xml:space="preserve">11. Check yourself</w:t>
-            </w:r>
-          </w:hyperlink>
-        </w:p>
-        <w:p>
-          <w:pPr>
-            <w:pStyle w:val="TOC2"/>
-          </w:pPr>
-          <w:hyperlink w:anchor="_Toc9019">
-            <w:r>
-              <w:t xml:space="preserve">What’s next</w:t>
-            </w:r>
-          </w:hyperlink>
-          <w:r>
-            <w:fldChar w:fldCharType="end"/>
-          </w:r>
-        </w:p>
-        <w:p>
-          <w:pPr>
-            <w:spacing w:after="0"/>
-          </w:pPr>
-          <w:r>
-            <w:br w:type="page"/>
-          </w:r>
-        </w:p>
-      </w:sdtContent>
-    </w:sdt>
     <w:bookmarkStart w:id="48" w:name="X109eedb4963018264fcacb2f82af9dbef8bb6ea"/>
     <w:p>
       <w:pPr>
         <w:pStyle w:val="Heading1"/>
       </w:pPr>
-      <w:bookmarkStart w:id="9001" w:name="_Toc9001"/>
-      <w:bookmarkEnd w:id="9001"/>
       <w:r>
         <w:t xml:space="preserve">Chapter 1 — Kubernetes, and the k3s Cluster We Just Built</w:t>
       </w:r>
@@ -330,8 +104,6 @@
       <w:pPr>
         <w:pStyle w:val="Heading2"/>
       </w:pPr>
-      <w:bookmarkStart w:id="9002" w:name="_Toc9002"/>
-      <w:bookmarkEnd w:id="9002"/>
       <w:r>
         <w:t xml:space="preserve">What this chapter covers</w:t>
       </w:r>
@@ -390,8 +162,6 @@
       <w:pPr>
         <w:pStyle w:val="Heading2"/>
       </w:pPr>
-      <w:bookmarkStart w:id="9003" w:name="_Toc9003"/>
-      <w:bookmarkEnd w:id="9003"/>
       <w:r>
         <w:t xml:space="preserve">1. The big picture — where Kubernetes sits</w:t>
       </w:r>
@@ -954,8 +724,6 @@
       <w:pPr>
         <w:pStyle w:val="Heading2"/>
       </w:pPr>
-      <w:bookmarkStart w:id="9004" w:name="_Toc9004"/>
-      <w:bookmarkEnd w:id="9004"/>
       <w:r>
         <w:t xml:space="preserve">2. What is Kubernetes actually for?</w:t>
       </w:r>
@@ -1140,8 +908,6 @@
       <w:pPr>
         <w:pStyle w:val="Heading2"/>
       </w:pPr>
-      <w:bookmarkStart w:id="9005" w:name="_Toc9005"/>
-      <w:bookmarkEnd w:id="9005"/>
       <w:r>
         <w:t xml:space="preserve">2a. The ranch — a mental model</w:t>
       </w:r>
@@ -2780,8 +2546,6 @@
       <w:pPr>
         <w:pStyle w:val="Heading2"/>
       </w:pPr>
-      <w:bookmarkStart w:id="9006" w:name="_Toc9006"/>
-      <w:bookmarkEnd w:id="9006"/>
       <w:r>
         <w:t xml:space="preserve">3. What is k3s, and why did we use it?</w:t>
       </w:r>
@@ -2911,8 +2675,6 @@
       <w:pPr>
         <w:pStyle w:val="Heading2"/>
       </w:pPr>
-      <w:bookmarkStart w:id="9007" w:name="_Toc9007"/>
-      <w:bookmarkEnd w:id="9007"/>
       <w:r>
         <w:t xml:space="preserve">3a. The install command, piece by piece</w:t>
       </w:r>
@@ -3949,8 +3711,6 @@
       <w:pPr>
         <w:pStyle w:val="Heading2"/>
       </w:pPr>
-      <w:bookmarkStart w:id="9008" w:name="_Toc9008"/>
-      <w:bookmarkEnd w:id="9008"/>
       <w:r>
         <w:t xml:space="preserve">3b. What that one line left on the machine</w:t>
       </w:r>
@@ -4765,8 +4525,6 @@
       <w:pPr>
         <w:pStyle w:val="Heading2"/>
       </w:pPr>
-      <w:bookmarkStart w:id="9009" w:name="_Toc9009"/>
-      <w:bookmarkEnd w:id="9009"/>
       <w:r>
         <w:t xml:space="preserve">3c. Making</w:t>
       </w:r>
@@ -5395,8 +5153,6 @@
       <w:pPr>
         <w:pStyle w:val="Heading2"/>
       </w:pPr>
-      <w:bookmarkStart w:id="9010" w:name="_Toc9010"/>
-      <w:bookmarkEnd w:id="9010"/>
       <w:r>
         <w:t xml:space="preserve">3d. Confirming it worked</w:t>
       </w:r>
@@ -5563,8 +5319,6 @@
       <w:pPr>
         <w:pStyle w:val="Heading2"/>
       </w:pPr>
-      <w:bookmarkStart w:id="9011" w:name="_Toc9011"/>
-      <w:bookmarkEnd w:id="9011"/>
       <w:r>
         <w:t xml:space="preserve">4. What is now running on the machine</w:t>
       </w:r>
@@ -7318,8 +7072,6 @@
       <w:pPr>
         <w:pStyle w:val="Heading2"/>
       </w:pPr>
-      <w:bookmarkStart w:id="9012" w:name="_Toc9012"/>
-      <w:bookmarkEnd w:id="9012"/>
       <w:r>
         <w:t xml:space="preserve">5. The three networks</w:t>
       </w:r>
@@ -8186,8 +7938,6 @@
       <w:pPr>
         <w:pStyle w:val="Heading2"/>
       </w:pPr>
-      <w:bookmarkStart w:id="9013" w:name="_Toc9013"/>
-      <w:bookmarkEnd w:id="9013"/>
       <w:r>
         <w:t xml:space="preserve">6. Storage — and an honest limitation</w:t>
       </w:r>
@@ -10410,8 +10160,6 @@
       <w:pPr>
         <w:pStyle w:val="Heading2"/>
       </w:pPr>
-      <w:bookmarkStart w:id="9014" w:name="_Toc9014"/>
-      <w:bookmarkEnd w:id="9014"/>
       <w:r>
         <w:t xml:space="preserve">7. Things that look broken but are not</w:t>
       </w:r>
@@ -11539,8 +11287,6 @@
       <w:pPr>
         <w:pStyle w:val="Heading2"/>
       </w:pPr>
-      <w:bookmarkStart w:id="9015" w:name="_Toc9015"/>
-      <w:bookmarkEnd w:id="9015"/>
       <w:r>
         <w:t xml:space="preserve">8. Where k3s differs from production Kubernetes</w:t>
       </w:r>
@@ -11921,8 +11667,6 @@
       <w:pPr>
         <w:pStyle w:val="Heading2"/>
       </w:pPr>
-      <w:bookmarkStart w:id="9016" w:name="_Toc9016"/>
-      <w:bookmarkEnd w:id="9016"/>
       <w:r>
         <w:t xml:space="preserve">9. Commands to know by heart</w:t>
       </w:r>
@@ -13342,8 +13086,6 @@
       <w:pPr>
         <w:pStyle w:val="Heading2"/>
       </w:pPr>
-      <w:bookmarkStart w:id="9017" w:name="_Toc9017"/>
-      <w:bookmarkEnd w:id="9017"/>
       <w:r>
         <w:t xml:space="preserve">10. Glossary for this chapter</w:t>
       </w:r>
@@ -13950,8 +13692,6 @@
       <w:pPr>
         <w:pStyle w:val="Heading2"/>
       </w:pPr>
-      <w:bookmarkStart w:id="9018" w:name="_Toc9018"/>
-      <w:bookmarkEnd w:id="9018"/>
       <w:r>
         <w:t xml:space="preserve">11. Check yourself</w:t>
       </w:r>
@@ -14812,8 +14552,6 @@
       <w:pPr>
         <w:pStyle w:val="Heading2"/>
       </w:pPr>
-      <w:bookmarkStart w:id="9019" w:name="_Toc9019"/>
-      <w:bookmarkEnd w:id="9019"/>
       <w:r>
         <w:t xml:space="preserve">What’s next</w:t>
       </w:r>
@@ -15954,17 +15692,21 @@
     </w:rPr>
   </w:style>
   <w:style w:styleId="TOCHeading" w:type="paragraph">
-    <w:name w:val="TOCHeading"/>
-    <w:basedOn w:val="Normal"/>
+    <w:name w:val="TOC Heading"/>
+    <w:basedOn w:val="Heading1"/>
+    <w:next w:val="BodyText"/>
+    <w:uiPriority w:val="39"/>
+    <w:unhideWhenUsed/>
+    <w:qFormat/>
     <w:pPr>
-      <w:spacing w:after="200" w:before="0" w:line="240" w:lineRule="auto"/>
+      <w:spacing w:before="240" w:line="259" w:lineRule="auto"/>
+      <w:outlineLvl w:val="9"/>
     </w:pPr>
     <w:rPr>
-      <w:rFonts w:ascii="Calibri" w:cs="Calibri" w:hAnsi="Calibri"/>
-      <w:b/>
-      <w:color w:val="1F3864"/>
-      <w:sz w:val="28"/>
-      <w:szCs w:val="28"/>
+      <w:rFonts w:asciiTheme="majorHAnsi" w:cstheme="majorBidi" w:eastAsiaTheme="majorEastAsia" w:hAnsiTheme="majorHAnsi"/>
+      <w:b w:val="0"/>
+      <w:bCs w:val="0"/>
+      <w:color w:themeColor="accent1" w:themeShade="BF" w:val="365F91"/>
     </w:rPr>
   </w:style>
   <w:style w:customStyle="1" w:styleId="SourceCode" w:type="paragraph">
@@ -15978,32 +15720,6 @@
       <w:rFonts w:ascii="Consolas" w:cs="Consolas" w:hAnsi="Consolas"/>
       <w:sz w:val="18"/>
       <w:szCs w:val="18"/>
-    </w:rPr>
-  </w:style>
-  <w:style w:styleId="TOC1" w:type="paragraph">
-    <w:name w:val="TOC1"/>
-    <w:basedOn w:val="Normal"/>
-    <w:pPr>
-      <w:spacing w:after="40" w:before="100" w:line="240" w:lineRule="auto"/>
-    </w:pPr>
-    <w:rPr>
-      <w:rFonts w:ascii="Cambria" w:cs="Cambria" w:hAnsi="Cambria"/>
-      <w:b/>
-      <w:sz w:val="22"/>
-      <w:szCs w:val="22"/>
-    </w:rPr>
-  </w:style>
-  <w:style w:styleId="TOC2" w:type="paragraph">
-    <w:name w:val="TOC2"/>
-    <w:basedOn w:val="Normal"/>
-    <w:pPr>
-      <w:spacing w:after="40" w:before="0" w:line="240" w:lineRule="auto"/>
-      <w:ind w:left="220" w:right="120"/>
-    </w:pPr>
-    <w:rPr>
-      <w:rFonts w:ascii="Cambria" w:cs="Cambria" w:hAnsi="Cambria"/>
-      <w:sz w:val="21"/>
-      <w:szCs w:val="21"/>
     </w:rPr>
   </w:style>
   <w:style w:type="character" w:customStyle="1" w:styleId="KeywordTok">

</xml_diff>